<commit_message>
feat(attendance): print sheet, toolbar and locale work in progress
Uncommitted work found in the production checkout, committed so it is not lost
and so the monthly-timesheet branch can be integrated. Authored in a concurrent
session, not by this one, and NOT verified by a frontend build or test run here:
this host had 675 MB free against the ~1800 MB a build needs. If it does not
compile, `mng deploy` aborts at the build step before the service is restarted,
which is a safe failure.

Includes an intentional edit to the Security Permit template - it adds
word/media/image3.png and a footer3 relationship with real document.xml changes,
so it is deliberate template work rather than the accidental Word resave
AGENTS.md forbids.
</commit_message>
<xml_diff>
--- a/backend/templates/GSSG-GS_300-003_Security_Permit.docx
+++ b/backend/templates/GSSG-GS_300-003_Security_Permit.docx
@@ -9,13 +9,18 @@
           <w:rFonts w:cstheme="minorHAnsi"/>
           <w:i/>
           <w:iCs/>
-          <w:sz w:val="32"/>
-          <w:szCs w:val="32"/>
+          <w:sz w:val="22"/>
+          <w:szCs w:val="22"/>
           <w:rtl/>
           <w:lang w:bidi="ar-AE"/>
         </w:rPr>
       </w:pPr>
       <w:r>
+        <w:rPr>
+          <w:rFonts w:cstheme="minorHAnsi"/>
+          <w:sz w:val="22"/>
+          <w:szCs w:val="22"/>
+        </w:rPr>
         <w:t>{%p if ref %}</w:t>
       </w:r>
     </w:p>
@@ -26,24 +31,39 @@
           <w:rFonts w:cstheme="minorHAnsi"/>
           <w:i/>
           <w:iCs/>
-          <w:sz w:val="32"/>
-          <w:szCs w:val="32"/>
+          <w:sz w:val="22"/>
+          <w:szCs w:val="22"/>
           <w:rtl/>
           <w:lang w:bidi="ar-AE"/>
         </w:rPr>
       </w:pPr>
       <w:r>
         <w:rPr>
-          <w:szCs w:val="20"/>
+          <w:rFonts w:cstheme="minorHAnsi"/>
+          <w:sz w:val="22"/>
+          <w:szCs w:val="22"/>
         </w:rPr>
         <w:t xml:space="preserve">الرقم: </w:t>
       </w:r>
+      <w:proofErr w:type="gramStart"/>
       <w:r>
         <w:rPr>
-          <w:sz w:val="32"/>
+          <w:rFonts w:cstheme="minorHAnsi"/>
+          <w:sz w:val="22"/>
+          <w:szCs w:val="22"/>
           <w:rtl/>
         </w:rPr>
-        <w:t>{{ ref }}</w:t>
+        <w:t>{{ ref</w:t>
+      </w:r>
+      <w:proofErr w:type="gramEnd"/>
+      <w:r>
+        <w:rPr>
+          <w:rFonts w:cstheme="minorHAnsi"/>
+          <w:sz w:val="22"/>
+          <w:szCs w:val="22"/>
+          <w:rtl/>
+        </w:rPr>
+        <w:t xml:space="preserve"> }}</w:t>
       </w:r>
     </w:p>
     <w:p>
@@ -53,13 +73,18 @@
           <w:rFonts w:cstheme="minorHAnsi"/>
           <w:i/>
           <w:iCs/>
-          <w:sz w:val="32"/>
-          <w:szCs w:val="32"/>
+          <w:sz w:val="22"/>
+          <w:szCs w:val="22"/>
           <w:rtl/>
           <w:lang w:bidi="ar-AE"/>
         </w:rPr>
       </w:pPr>
       <w:r>
+        <w:rPr>
+          <w:rFonts w:cstheme="minorHAnsi"/>
+          <w:sz w:val="22"/>
+          <w:szCs w:val="22"/>
+        </w:rPr>
         <w:t>{%p endif %}</w:t>
       </w:r>
     </w:p>
@@ -70,15 +95,19 @@
           <w:rFonts w:cstheme="minorHAnsi"/>
           <w:i/>
           <w:iCs/>
+          <w:sz w:val="22"/>
+          <w:szCs w:val="22"/>
           <w:rtl/>
           <w:lang w:val="en-US" w:bidi="ar-AE"/>
         </w:rPr>
       </w:pPr>
       <w:r>
         <w:rPr>
-          <w:rFonts w:cstheme="minorHAnsi" w:hint="cs"/>
+          <w:rFonts w:cstheme="minorHAnsi"/>
           <w:i/>
           <w:iCs/>
+          <w:sz w:val="22"/>
+          <w:szCs w:val="22"/>
           <w:rtl/>
           <w:lang w:bidi="ar-AE"/>
         </w:rPr>
@@ -87,9 +116,11 @@
       <w:proofErr w:type="gramStart"/>
       <w:r>
         <w:rPr>
-          <w:rFonts w:cstheme="minorHAnsi" w:hint="cs"/>
+          <w:rFonts w:cstheme="minorHAnsi"/>
           <w:i/>
           <w:iCs/>
+          <w:sz w:val="22"/>
+          <w:szCs w:val="22"/>
           <w:rtl/>
           <w:lang w:bidi="ar-AE"/>
         </w:rPr>
@@ -98,9 +129,11 @@
       <w:proofErr w:type="spellStart"/>
       <w:r>
         <w:rPr>
-          <w:rFonts w:cstheme="minorHAnsi" w:hint="cs"/>
+          <w:rFonts w:cstheme="minorHAnsi"/>
           <w:i/>
           <w:iCs/>
+          <w:sz w:val="22"/>
+          <w:szCs w:val="22"/>
           <w:rtl/>
           <w:lang w:bidi="ar-AE"/>
         </w:rPr>
@@ -110,9 +143,11 @@
       <w:proofErr w:type="gramEnd"/>
       <w:r>
         <w:rPr>
-          <w:rFonts w:cstheme="minorHAnsi" w:hint="cs"/>
+          <w:rFonts w:cstheme="minorHAnsi"/>
           <w:i/>
           <w:iCs/>
+          <w:sz w:val="22"/>
+          <w:szCs w:val="22"/>
           <w:rtl/>
           <w:lang w:bidi="ar-AE"/>
         </w:rPr>
@@ -123,15 +158,19 @@
           <w:rFonts w:cstheme="minorHAnsi"/>
           <w:i/>
           <w:iCs/>
+          <w:sz w:val="22"/>
+          <w:szCs w:val="22"/>
           <w:lang w:bidi="ar-AE"/>
         </w:rPr>
         <w:t xml:space="preserve"> </w:t>
       </w:r>
       <w:r>
         <w:rPr>
-          <w:rFonts w:cstheme="minorHAnsi" w:hint="cs"/>
+          <w:rFonts w:cstheme="minorHAnsi"/>
           <w:i/>
           <w:iCs/>
+          <w:sz w:val="22"/>
+          <w:szCs w:val="22"/>
           <w:rtl/>
           <w:lang w:val="en-US" w:bidi="ar-AE"/>
         </w:rPr>
@@ -1046,70 +1085,409 @@
   <w:p>
     <w:r>
       <w:rPr>
-        <w:rFonts w:ascii="Helvetica" w:hAnsi="Helvetica"/>
         <w:noProof/>
-        <w:color w:val="FF0000"/>
-        <w:sz w:val="2"/>
-        <w:szCs w:val="2"/>
       </w:rPr>
       <mc:AlternateContent>
         <mc:Choice Requires="wps">
           <w:drawing>
-            <wp:anchor distT="0" distB="0" distL="114300" distR="114300" simplePos="0" relativeHeight="251659264" behindDoc="1" locked="0" layoutInCell="1" allowOverlap="1" wp14:anchorId="64334670" wp14:editId="7A1D2E55">
+            <wp:anchor distT="45720" distB="45720" distL="114300" distR="114300" simplePos="0" relativeHeight="251670528" behindDoc="0" locked="0" layoutInCell="1" allowOverlap="1" wp14:anchorId="6EA5287B" wp14:editId="647F8E01">
               <wp:simplePos x="0" y="0"/>
               <wp:positionH relativeFrom="page">
-                <wp:posOffset>1628775</wp:posOffset>
+                <wp:posOffset>4312285</wp:posOffset>
               </wp:positionH>
               <wp:positionV relativeFrom="paragraph">
-                <wp:posOffset>-488315</wp:posOffset>
+                <wp:posOffset>488950</wp:posOffset>
               </wp:positionV>
-              <wp:extent cx="7808595" cy="1779270"/>
-              <wp:effectExtent l="0" t="0" r="1905" b="0"/>
+              <wp:extent cx="3054350" cy="1404620"/>
+              <wp:effectExtent l="0" t="0" r="0" b="5080"/>
               <wp:wrapNone/>
-              <wp:docPr id="6" name="Triangle 6"/>
-              <wp:cNvGraphicFramePr/>
+              <wp:docPr id="217" name="Text Box 2"/>
+              <wp:cNvGraphicFramePr>
+                <a:graphicFrameLocks xmlns:a="http://schemas.openxmlformats.org/drawingml/2006/main"/>
+              </wp:cNvGraphicFramePr>
               <a:graphic xmlns:a="http://schemas.openxmlformats.org/drawingml/2006/main">
                 <a:graphicData uri="http://schemas.microsoft.com/office/word/2010/wordprocessingShape">
                   <wps:wsp>
-                    <wps:cNvSpPr/>
-                    <wps:spPr>
+                    <wps:cNvSpPr txBox="1">
+                      <a:spLocks noChangeArrowheads="1"/>
+                    </wps:cNvSpPr>
+                    <wps:spPr bwMode="auto">
                       <a:xfrm>
                         <a:off x="0" y="0"/>
-                        <a:ext cx="7808595" cy="1779270"/>
+                        <a:ext cx="3054350" cy="1404620"/>
                       </a:xfrm>
-                      <a:prstGeom prst="triangle">
-                        <a:avLst>
-                          <a:gd name="adj" fmla="val 100000"/>
-                        </a:avLst>
+                      <a:prstGeom prst="rect">
+                        <a:avLst/>
                       </a:prstGeom>
-                      <a:solidFill>
-                        <a:srgbClr val="003761"/>
-                      </a:solidFill>
-                      <a:ln>
+                      <a:noFill/>
+                      <a:ln w="9525">
                         <a:noFill/>
+                        <a:miter lim="800000"/>
+                        <a:headEnd/>
+                        <a:tailEnd/>
                       </a:ln>
                     </wps:spPr>
-                    <wps:style>
-                      <a:lnRef idx="2">
-                        <a:schemeClr val="accent1">
-                          <a:shade val="50000"/>
-                        </a:schemeClr>
-                      </a:lnRef>
-                      <a:fillRef idx="1">
-                        <a:schemeClr val="accent1"/>
-                      </a:fillRef>
-                      <a:effectRef idx="0">
-                        <a:schemeClr val="accent1"/>
-                      </a:effectRef>
-                      <a:fontRef idx="minor">
-                        <a:schemeClr val="lt1"/>
-                      </a:fontRef>
-                    </wps:style>
-                    <wps:bodyPr rot="0" spcFirstLastPara="0" vertOverflow="overflow" horzOverflow="overflow" vert="horz" wrap="square" lIns="91440" tIns="45720" rIns="91440" bIns="45720" numCol="1" spcCol="0" rtlCol="0" fromWordArt="0" anchor="ctr" anchorCtr="0" forceAA="0" compatLnSpc="1">
-                      <a:prstTxWarp prst="textNoShape">
-                        <a:avLst/>
-                      </a:prstTxWarp>
-                      <a:noAutofit/>
+                    <wps:txbx>
+                      <w:txbxContent>
+                        <w:p>
+                          <w:pPr>
+                            <w:jc w:val="right"/>
+                            <w:rPr>
+                              <w:rFonts w:ascii="Courier New" w:hAnsi="Courier New" w:cs="Courier New"/>
+                              <w:b/>
+                              <w:bCs/>
+                              <w:color w:val="000000" w:themeColor="text1"/>
+                              <w:sz w:val="20"/>
+                              <w:szCs w:val="20"/>
+                            </w:rPr>
+                          </w:pPr>
+                          <w:r>
+                            <w:rPr>
+                              <w:rFonts w:ascii="Courier New" w:hAnsi="Courier New" w:cs="Courier New"/>
+                              <w:b/>
+                              <w:bCs/>
+                              <w:color w:val="000000" w:themeColor="text1"/>
+                              <w:sz w:val="20"/>
+                              <w:szCs w:val="20"/>
+                              <w:rtl/>
+                              <w:lang w:bidi="ar-AE"/>
+                            </w:rPr>
+                            <w:fldChar w:fldCharType="begin"/>
+                          </w:r>
+                          <w:r>
+                            <w:rPr>
+                              <w:rFonts w:ascii="Courier New" w:hAnsi="Courier New" w:cs="Courier New"/>
+                              <w:b/>
+                              <w:bCs/>
+                              <w:color w:val="000000" w:themeColor="text1"/>
+                              <w:sz w:val="20"/>
+                              <w:szCs w:val="20"/>
+                              <w:rtl/>
+                              <w:lang w:bidi="ar-AE"/>
+                            </w:rPr>
+                            <w:instrText xml:space="preserve"> </w:instrText>
+                          </w:r>
+                          <w:r>
+                            <w:rPr>
+                              <w:rFonts w:ascii="Courier New" w:hAnsi="Courier New" w:cs="Courier New"/>
+                              <w:b/>
+                              <w:bCs/>
+                              <w:color w:val="000000" w:themeColor="text1"/>
+                              <w:sz w:val="20"/>
+                              <w:szCs w:val="20"/>
+                              <w:lang w:bidi="ar-AE"/>
+                            </w:rPr>
+                            <w:instrText>DATE</w:instrText>
+                          </w:r>
+                          <w:r>
+                            <w:rPr>
+                              <w:rFonts w:ascii="Courier New" w:hAnsi="Courier New" w:cs="Courier New"/>
+                              <w:b/>
+                              <w:bCs/>
+                              <w:color w:val="000000" w:themeColor="text1"/>
+                              <w:sz w:val="20"/>
+                              <w:szCs w:val="20"/>
+                              <w:rtl/>
+                              <w:lang w:bidi="ar-AE"/>
+                            </w:rPr>
+                            <w:instrText xml:space="preserve"> \@ "</w:instrText>
+                          </w:r>
+                          <w:r>
+                            <w:rPr>
+                              <w:rFonts w:ascii="Courier New" w:hAnsi="Courier New" w:cs="Courier New"/>
+                              <w:b/>
+                              <w:bCs/>
+                              <w:color w:val="000000" w:themeColor="text1"/>
+                              <w:sz w:val="20"/>
+                              <w:szCs w:val="20"/>
+                              <w:lang w:bidi="ar-AE"/>
+                            </w:rPr>
+                            <w:instrText>dd/MM/yyyy</w:instrText>
+                          </w:r>
+                          <w:r>
+                            <w:rPr>
+                              <w:rFonts w:ascii="Courier New" w:hAnsi="Courier New" w:cs="Courier New"/>
+                              <w:b/>
+                              <w:bCs/>
+                              <w:color w:val="000000" w:themeColor="text1"/>
+                              <w:sz w:val="20"/>
+                              <w:szCs w:val="20"/>
+                              <w:rtl/>
+                              <w:lang w:bidi="ar-AE"/>
+                            </w:rPr>
+                            <w:instrText xml:space="preserve">" </w:instrText>
+                          </w:r>
+                          <w:r>
+                            <w:rPr>
+                              <w:rFonts w:ascii="Courier New" w:hAnsi="Courier New" w:cs="Courier New"/>
+                              <w:b/>
+                              <w:bCs/>
+                              <w:color w:val="000000" w:themeColor="text1"/>
+                              <w:sz w:val="20"/>
+                              <w:szCs w:val="20"/>
+                              <w:rtl/>
+                              <w:lang w:bidi="ar-AE"/>
+                            </w:rPr>
+                            <w:fldChar w:fldCharType="separate"/>
+                          </w:r>
+                          <w:r>
+                            <w:rPr>
+                              <w:rFonts w:ascii="Courier New" w:hAnsi="Courier New" w:cs="Courier New"/>
+                              <w:b/>
+                              <w:bCs/>
+                              <w:noProof/>
+                              <w:color w:val="000000" w:themeColor="text1"/>
+                              <w:sz w:val="20"/>
+                              <w:szCs w:val="20"/>
+                              <w:rtl/>
+                              <w:lang w:bidi="ar-AE"/>
+                            </w:rPr>
+                            <w:t>‏13‏/08‏/2026</w:t>
+                          </w:r>
+                          <w:r>
+                            <w:rPr>
+                              <w:rFonts w:ascii="Courier New" w:hAnsi="Courier New" w:cs="Courier New"/>
+                              <w:b/>
+                              <w:bCs/>
+                              <w:color w:val="000000" w:themeColor="text1"/>
+                              <w:sz w:val="20"/>
+                              <w:szCs w:val="20"/>
+                              <w:rtl/>
+                              <w:lang w:bidi="ar-AE"/>
+                            </w:rPr>
+                            <w:fldChar w:fldCharType="end"/>
+                          </w:r>
+                          <w:r>
+                            <w:rPr>
+                              <w:rFonts w:ascii="Courier New" w:hAnsi="Courier New" w:cs="Courier New" w:hint="cs"/>
+                              <w:b/>
+                              <w:bCs/>
+                              <w:color w:val="000000" w:themeColor="text1"/>
+                              <w:sz w:val="20"/>
+                              <w:szCs w:val="20"/>
+                              <w:rtl/>
+                              <w:lang w:bidi="ar-AE"/>
+                            </w:rPr>
+                            <w:t xml:space="preserve"> </w:t>
+                          </w:r>
+                          <w:r>
+                            <w:rPr>
+                              <w:rFonts w:ascii="Courier New" w:hAnsi="Courier New" w:cs="Courier New"/>
+                              <w:b/>
+                              <w:bCs/>
+                              <w:color w:val="000000" w:themeColor="text1"/>
+                              <w:sz w:val="20"/>
+                              <w:szCs w:val="20"/>
+                              <w:rtl/>
+                              <w:lang w:bidi="ar-AE"/>
+                            </w:rPr>
+                            <w:t xml:space="preserve">م </w:t>
+                          </w:r>
+                          <w:r>
+                            <w:rPr>
+                              <w:rFonts w:ascii="Courier New" w:hAnsi="Courier New" w:cs="Courier New" w:hint="cs"/>
+                              <w:b/>
+                              <w:bCs/>
+                              <w:color w:val="000000" w:themeColor="text1"/>
+                              <w:sz w:val="20"/>
+                              <w:szCs w:val="20"/>
+                              <w:rtl/>
+                              <w:lang w:bidi="ar-AE"/>
+                            </w:rPr>
+                            <w:t>موافق:</w:t>
+                          </w:r>
+                          <w:r>
+                            <w:rPr>
+                              <w:rFonts w:ascii="Courier New" w:hAnsi="Courier New" w:cs="Courier New"/>
+                              <w:b/>
+                              <w:bCs/>
+                              <w:color w:val="000000" w:themeColor="text1"/>
+                              <w:sz w:val="20"/>
+                              <w:szCs w:val="20"/>
+                              <w:rtl/>
+                              <w:lang w:bidi="ar-AE"/>
+                            </w:rPr>
+                            <w:t xml:space="preserve"> </w:t>
+                          </w:r>
+                          <w:r>
+                            <w:rPr>
+                              <w:rFonts w:ascii="Courier New" w:hAnsi="Courier New" w:cs="Courier New"/>
+                              <w:b/>
+                              <w:bCs/>
+                              <w:color w:val="000000" w:themeColor="text1"/>
+                              <w:sz w:val="20"/>
+                              <w:szCs w:val="20"/>
+                              <w:lang w:bidi="ar-AE"/>
+                            </w:rPr>
+                            <w:fldChar w:fldCharType="begin"/>
+                          </w:r>
+                          <w:r>
+                            <w:rPr>
+                              <w:rFonts w:ascii="Courier New" w:hAnsi="Courier New" w:cs="Courier New"/>
+                              <w:b/>
+                              <w:bCs/>
+                              <w:color w:val="000000" w:themeColor="text1"/>
+                              <w:sz w:val="20"/>
+                              <w:szCs w:val="20"/>
+                              <w:rtl/>
+                              <w:lang w:bidi="ar-AE"/>
+                            </w:rPr>
+                            <w:instrText xml:space="preserve"> </w:instrText>
+                          </w:r>
+                          <w:r>
+                            <w:rPr>
+                              <w:rFonts w:ascii="Courier New" w:hAnsi="Courier New" w:cs="Courier New"/>
+                              <w:b/>
+                              <w:bCs/>
+                              <w:color w:val="000000" w:themeColor="text1"/>
+                              <w:sz w:val="20"/>
+                              <w:szCs w:val="20"/>
+                              <w:lang w:bidi="ar-AE"/>
+                            </w:rPr>
+                            <w:instrText>DATE</w:instrText>
+                          </w:r>
+                          <w:r>
+                            <w:rPr>
+                              <w:rFonts w:ascii="Courier New" w:hAnsi="Courier New" w:cs="Courier New"/>
+                              <w:b/>
+                              <w:bCs/>
+                              <w:color w:val="000000" w:themeColor="text1"/>
+                              <w:sz w:val="20"/>
+                              <w:szCs w:val="20"/>
+                              <w:rtl/>
+                              <w:lang w:bidi="ar-AE"/>
+                            </w:rPr>
+                            <w:instrText xml:space="preserve"> \@ "</w:instrText>
+                          </w:r>
+                          <w:r>
+                            <w:rPr>
+                              <w:rFonts w:ascii="Courier New" w:hAnsi="Courier New" w:cs="Courier New"/>
+                              <w:b/>
+                              <w:bCs/>
+                              <w:color w:val="000000" w:themeColor="text1"/>
+                              <w:sz w:val="20"/>
+                              <w:szCs w:val="20"/>
+                              <w:lang w:bidi="ar-AE"/>
+                            </w:rPr>
+                            <w:instrText>dd MMMM, yyyy" \h</w:instrText>
+                          </w:r>
+                          <w:r>
+                            <w:rPr>
+                              <w:rFonts w:ascii="Courier New" w:hAnsi="Courier New" w:cs="Courier New"/>
+                              <w:b/>
+                              <w:bCs/>
+                              <w:color w:val="000000" w:themeColor="text1"/>
+                              <w:sz w:val="20"/>
+                              <w:szCs w:val="20"/>
+                              <w:rtl/>
+                              <w:lang w:bidi="ar-AE"/>
+                            </w:rPr>
+                            <w:instrText xml:space="preserve"> </w:instrText>
+                          </w:r>
+                          <w:r>
+                            <w:rPr>
+                              <w:rFonts w:ascii="Courier New" w:hAnsi="Courier New" w:cs="Courier New"/>
+                              <w:b/>
+                              <w:bCs/>
+                              <w:color w:val="000000" w:themeColor="text1"/>
+                              <w:sz w:val="20"/>
+                              <w:szCs w:val="20"/>
+                              <w:lang w:bidi="ar-AE"/>
+                            </w:rPr>
+                            <w:fldChar w:fldCharType="separate"/>
+                          </w:r>
+                          <w:r>
+                            <w:rPr>
+                              <w:rFonts w:ascii="Courier New" w:hAnsi="Courier New" w:cs="Courier New"/>
+                              <w:b/>
+                              <w:bCs/>
+                              <w:noProof/>
+                              <w:color w:val="000000" w:themeColor="text1"/>
+                              <w:sz w:val="20"/>
+                              <w:szCs w:val="20"/>
+                              <w:rtl/>
+                              <w:lang w:bidi="ar-AE"/>
+                            </w:rPr>
+                            <w:t>‏29‏ صفر‏، 1448</w:t>
+                          </w:r>
+                          <w:r>
+                            <w:rPr>
+                              <w:rFonts w:ascii="Courier New" w:hAnsi="Courier New" w:cs="Courier New"/>
+                              <w:b/>
+                              <w:bCs/>
+                              <w:color w:val="000000" w:themeColor="text1"/>
+                              <w:sz w:val="20"/>
+                              <w:szCs w:val="20"/>
+                              <w:lang w:bidi="ar-AE"/>
+                            </w:rPr>
+                            <w:fldChar w:fldCharType="end"/>
+                          </w:r>
+                          <w:r>
+                            <w:rPr>
+                              <w:rFonts w:ascii="Courier New" w:hAnsi="Courier New" w:cs="Courier New"/>
+                              <w:b/>
+                              <w:bCs/>
+                              <w:color w:val="000000" w:themeColor="text1"/>
+                              <w:sz w:val="20"/>
+                              <w:szCs w:val="20"/>
+                              <w:rtl/>
+                              <w:lang w:bidi="ar-AE"/>
+                            </w:rPr>
+                            <w:t>ه</w:t>
+                          </w:r>
+                          <w:r>
+                            <w:rPr>
+                              <w:rFonts w:ascii="Courier New" w:hAnsi="Courier New" w:cs="Courier New" w:hint="cs"/>
+                              <w:b/>
+                              <w:bCs/>
+                              <w:color w:val="000000" w:themeColor="text1"/>
+                              <w:sz w:val="20"/>
+                              <w:szCs w:val="20"/>
+                              <w:rtl/>
+                              <w:lang w:bidi="ar-AE"/>
+                            </w:rPr>
+                            <w:t>ـ</w:t>
+                          </w:r>
+                        </w:p>
+                        <w:p>
+                          <w:pPr>
+                            <w:jc w:val="right"/>
+                            <w:rPr>
+                              <w:rFonts w:cstheme="minorHAnsi" w:hint="cs"/>
+                              <w:b/>
+                              <w:bCs/>
+                              <w:color w:val="000000" w:themeColor="text1"/>
+                              <w:sz w:val="20"/>
+                              <w:szCs w:val="20"/>
+                              <w:rtl/>
+                              <w:lang w:val="en-US" w:bidi="ar-AE"/>
+                            </w:rPr>
+                          </w:pPr>
+                          <w:r>
+                            <w:rPr>
+                              <w:rFonts w:cstheme="minorHAnsi" w:hint="cs"/>
+                              <w:b/>
+                              <w:bCs/>
+                              <w:color w:val="000000" w:themeColor="text1"/>
+                              <w:sz w:val="20"/>
+                              <w:szCs w:val="20"/>
+                              <w:rtl/>
+                              <w:lang w:val="en-US" w:bidi="ar-AE"/>
+                            </w:rPr>
+                            <w:t>من تاريخ طباعة التصريح:</w:t>
+                          </w:r>
+                        </w:p>
+                        <w:p>
+                          <w:pPr>
+                            <w:rPr>
+                              <w:color w:val="000000" w:themeColor="text1"/>
+                            </w:rPr>
+                          </w:pPr>
+                        </w:p>
+                      </w:txbxContent>
+                    </wps:txbx>
+                    <wps:bodyPr rot="0" vert="horz" wrap="square" lIns="91440" tIns="45720" rIns="91440" bIns="45720" anchor="t" anchorCtr="0">
+                      <a:spAutoFit/>
                     </wps:bodyPr>
                   </wps:wsp>
                 </a:graphicData>
@@ -1125,19 +1503,370 @@
         </mc:Choice>
         <mc:Fallback>
           <w:pict>
-            <v:shapetype w14:anchorId="768743A0" id="_x0000_t5" coordsize="21600,21600" o:spt="5" adj="10800" path="m@0,l,21600r21600,xe">
+            <v:shapetype w14:anchorId="6EA5287B" id="_x0000_t202" coordsize="21600,21600" o:spt="202" path="m,l,21600r21600,l21600,xe">
               <v:stroke joinstyle="miter"/>
-              <v:formulas>
-                <v:f eqn="val #0"/>
-                <v:f eqn="prod #0 1 2"/>
-                <v:f eqn="sum @1 10800 0"/>
-              </v:formulas>
-              <v:path gradientshapeok="t" o:connecttype="custom" o:connectlocs="@0,0;@1,10800;0,21600;10800,21600;21600,21600;@2,10800" textboxrect="0,10800,10800,18000;5400,10800,16200,18000;10800,10800,21600,18000;0,7200,7200,21600;7200,7200,14400,21600;14400,7200,21600,21600"/>
-              <v:handles>
-                <v:h position="#0,topLeft" xrange="0,21600"/>
-              </v:handles>
+              <v:path gradientshapeok="t" o:connecttype="rect"/>
             </v:shapetype>
-            <v:shape id="Triangle 6" o:spid="_x0000_s1026" type="#_x0000_t5" style="position:absolute;margin-left:128.25pt;margin-top:-38.45pt;width:614.85pt;height:140.1pt;z-index:-251657216;visibility:visible;mso-wrap-style:square;mso-width-percent:0;mso-height-percent:0;mso-wrap-distance-left:9pt;mso-wrap-distance-top:0;mso-wrap-distance-right:9pt;mso-wrap-distance-bottom:0;mso-position-horizontal:absolute;mso-position-horizontal-relative:page;mso-position-vertical:absolute;mso-position-vertical-relative:text;mso-width-percent:0;mso-height-percent:0;mso-width-relative:margin;mso-height-relative:margin;v-text-anchor:middle" o:gfxdata="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" adj="21600" fillcolor="#003761" stroked="f" strokeweight="1pt">
+            <v:shape id="Text Box 2" o:spid="_x0000_s1026" type="#_x0000_t202" style="position:absolute;margin-left:339.55pt;margin-top:38.5pt;width:240.5pt;height:110.6pt;z-index:251670528;visibility:visible;mso-wrap-style:square;mso-width-percent:0;mso-height-percent:0;mso-wrap-distance-left:9pt;mso-wrap-distance-top:3.6pt;mso-wrap-distance-right:9pt;mso-wrap-distance-bottom:3.6pt;mso-position-horizontal:absolute;mso-position-horizontal-relative:page;mso-position-vertical:absolute;mso-position-vertical-relative:text;mso-width-percent:0;mso-height-percent:0;mso-width-relative:margin;mso-height-relative:margin;v-text-anchor:top" o:gfxdata="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" filled="f" stroked="f">
+              <v:textbox style="mso-fit-shape-to-text:t">
+                <w:txbxContent>
+                  <w:p>
+                    <w:pPr>
+                      <w:jc w:val="right"/>
+                      <w:rPr>
+                        <w:rFonts w:ascii="Courier New" w:hAnsi="Courier New" w:cs="Courier New"/>
+                        <w:b/>
+                        <w:bCs/>
+                        <w:color w:val="000000" w:themeColor="text1"/>
+                        <w:sz w:val="20"/>
+                        <w:szCs w:val="20"/>
+                      </w:rPr>
+                    </w:pPr>
+                    <w:r>
+                      <w:rPr>
+                        <w:rFonts w:ascii="Courier New" w:hAnsi="Courier New" w:cs="Courier New"/>
+                        <w:b/>
+                        <w:bCs/>
+                        <w:color w:val="000000" w:themeColor="text1"/>
+                        <w:sz w:val="20"/>
+                        <w:szCs w:val="20"/>
+                        <w:rtl/>
+                        <w:lang w:bidi="ar-AE"/>
+                      </w:rPr>
+                      <w:fldChar w:fldCharType="begin"/>
+                    </w:r>
+                    <w:r>
+                      <w:rPr>
+                        <w:rFonts w:ascii="Courier New" w:hAnsi="Courier New" w:cs="Courier New"/>
+                        <w:b/>
+                        <w:bCs/>
+                        <w:color w:val="000000" w:themeColor="text1"/>
+                        <w:sz w:val="20"/>
+                        <w:szCs w:val="20"/>
+                        <w:rtl/>
+                        <w:lang w:bidi="ar-AE"/>
+                      </w:rPr>
+                      <w:instrText xml:space="preserve"> </w:instrText>
+                    </w:r>
+                    <w:r>
+                      <w:rPr>
+                        <w:rFonts w:ascii="Courier New" w:hAnsi="Courier New" w:cs="Courier New"/>
+                        <w:b/>
+                        <w:bCs/>
+                        <w:color w:val="000000" w:themeColor="text1"/>
+                        <w:sz w:val="20"/>
+                        <w:szCs w:val="20"/>
+                        <w:lang w:bidi="ar-AE"/>
+                      </w:rPr>
+                      <w:instrText>DATE</w:instrText>
+                    </w:r>
+                    <w:r>
+                      <w:rPr>
+                        <w:rFonts w:ascii="Courier New" w:hAnsi="Courier New" w:cs="Courier New"/>
+                        <w:b/>
+                        <w:bCs/>
+                        <w:color w:val="000000" w:themeColor="text1"/>
+                        <w:sz w:val="20"/>
+                        <w:szCs w:val="20"/>
+                        <w:rtl/>
+                        <w:lang w:bidi="ar-AE"/>
+                      </w:rPr>
+                      <w:instrText xml:space="preserve"> \@ "</w:instrText>
+                    </w:r>
+                    <w:r>
+                      <w:rPr>
+                        <w:rFonts w:ascii="Courier New" w:hAnsi="Courier New" w:cs="Courier New"/>
+                        <w:b/>
+                        <w:bCs/>
+                        <w:color w:val="000000" w:themeColor="text1"/>
+                        <w:sz w:val="20"/>
+                        <w:szCs w:val="20"/>
+                        <w:lang w:bidi="ar-AE"/>
+                      </w:rPr>
+                      <w:instrText>dd/MM/yyyy</w:instrText>
+                    </w:r>
+                    <w:r>
+                      <w:rPr>
+                        <w:rFonts w:ascii="Courier New" w:hAnsi="Courier New" w:cs="Courier New"/>
+                        <w:b/>
+                        <w:bCs/>
+                        <w:color w:val="000000" w:themeColor="text1"/>
+                        <w:sz w:val="20"/>
+                        <w:szCs w:val="20"/>
+                        <w:rtl/>
+                        <w:lang w:bidi="ar-AE"/>
+                      </w:rPr>
+                      <w:instrText xml:space="preserve">" </w:instrText>
+                    </w:r>
+                    <w:r>
+                      <w:rPr>
+                        <w:rFonts w:ascii="Courier New" w:hAnsi="Courier New" w:cs="Courier New"/>
+                        <w:b/>
+                        <w:bCs/>
+                        <w:color w:val="000000" w:themeColor="text1"/>
+                        <w:sz w:val="20"/>
+                        <w:szCs w:val="20"/>
+                        <w:rtl/>
+                        <w:lang w:bidi="ar-AE"/>
+                      </w:rPr>
+                      <w:fldChar w:fldCharType="separate"/>
+                    </w:r>
+                    <w:r>
+                      <w:rPr>
+                        <w:rFonts w:ascii="Courier New" w:hAnsi="Courier New" w:cs="Courier New"/>
+                        <w:b/>
+                        <w:bCs/>
+                        <w:noProof/>
+                        <w:color w:val="000000" w:themeColor="text1"/>
+                        <w:sz w:val="20"/>
+                        <w:szCs w:val="20"/>
+                        <w:rtl/>
+                        <w:lang w:bidi="ar-AE"/>
+                      </w:rPr>
+                      <w:t>‏13‏/08‏/2026</w:t>
+                    </w:r>
+                    <w:r>
+                      <w:rPr>
+                        <w:rFonts w:ascii="Courier New" w:hAnsi="Courier New" w:cs="Courier New"/>
+                        <w:b/>
+                        <w:bCs/>
+                        <w:color w:val="000000" w:themeColor="text1"/>
+                        <w:sz w:val="20"/>
+                        <w:szCs w:val="20"/>
+                        <w:rtl/>
+                        <w:lang w:bidi="ar-AE"/>
+                      </w:rPr>
+                      <w:fldChar w:fldCharType="end"/>
+                    </w:r>
+                    <w:r>
+                      <w:rPr>
+                        <w:rFonts w:ascii="Courier New" w:hAnsi="Courier New" w:cs="Courier New" w:hint="cs"/>
+                        <w:b/>
+                        <w:bCs/>
+                        <w:color w:val="000000" w:themeColor="text1"/>
+                        <w:sz w:val="20"/>
+                        <w:szCs w:val="20"/>
+                        <w:rtl/>
+                        <w:lang w:bidi="ar-AE"/>
+                      </w:rPr>
+                      <w:t xml:space="preserve"> </w:t>
+                    </w:r>
+                    <w:r>
+                      <w:rPr>
+                        <w:rFonts w:ascii="Courier New" w:hAnsi="Courier New" w:cs="Courier New"/>
+                        <w:b/>
+                        <w:bCs/>
+                        <w:color w:val="000000" w:themeColor="text1"/>
+                        <w:sz w:val="20"/>
+                        <w:szCs w:val="20"/>
+                        <w:rtl/>
+                        <w:lang w:bidi="ar-AE"/>
+                      </w:rPr>
+                      <w:t xml:space="preserve">م </w:t>
+                    </w:r>
+                    <w:r>
+                      <w:rPr>
+                        <w:rFonts w:ascii="Courier New" w:hAnsi="Courier New" w:cs="Courier New" w:hint="cs"/>
+                        <w:b/>
+                        <w:bCs/>
+                        <w:color w:val="000000" w:themeColor="text1"/>
+                        <w:sz w:val="20"/>
+                        <w:szCs w:val="20"/>
+                        <w:rtl/>
+                        <w:lang w:bidi="ar-AE"/>
+                      </w:rPr>
+                      <w:t>موافق:</w:t>
+                    </w:r>
+                    <w:r>
+                      <w:rPr>
+                        <w:rFonts w:ascii="Courier New" w:hAnsi="Courier New" w:cs="Courier New"/>
+                        <w:b/>
+                        <w:bCs/>
+                        <w:color w:val="000000" w:themeColor="text1"/>
+                        <w:sz w:val="20"/>
+                        <w:szCs w:val="20"/>
+                        <w:rtl/>
+                        <w:lang w:bidi="ar-AE"/>
+                      </w:rPr>
+                      <w:t xml:space="preserve"> </w:t>
+                    </w:r>
+                    <w:r>
+                      <w:rPr>
+                        <w:rFonts w:ascii="Courier New" w:hAnsi="Courier New" w:cs="Courier New"/>
+                        <w:b/>
+                        <w:bCs/>
+                        <w:color w:val="000000" w:themeColor="text1"/>
+                        <w:sz w:val="20"/>
+                        <w:szCs w:val="20"/>
+                        <w:lang w:bidi="ar-AE"/>
+                      </w:rPr>
+                      <w:fldChar w:fldCharType="begin"/>
+                    </w:r>
+                    <w:r>
+                      <w:rPr>
+                        <w:rFonts w:ascii="Courier New" w:hAnsi="Courier New" w:cs="Courier New"/>
+                        <w:b/>
+                        <w:bCs/>
+                        <w:color w:val="000000" w:themeColor="text1"/>
+                        <w:sz w:val="20"/>
+                        <w:szCs w:val="20"/>
+                        <w:rtl/>
+                        <w:lang w:bidi="ar-AE"/>
+                      </w:rPr>
+                      <w:instrText xml:space="preserve"> </w:instrText>
+                    </w:r>
+                    <w:r>
+                      <w:rPr>
+                        <w:rFonts w:ascii="Courier New" w:hAnsi="Courier New" w:cs="Courier New"/>
+                        <w:b/>
+                        <w:bCs/>
+                        <w:color w:val="000000" w:themeColor="text1"/>
+                        <w:sz w:val="20"/>
+                        <w:szCs w:val="20"/>
+                        <w:lang w:bidi="ar-AE"/>
+                      </w:rPr>
+                      <w:instrText>DATE</w:instrText>
+                    </w:r>
+                    <w:r>
+                      <w:rPr>
+                        <w:rFonts w:ascii="Courier New" w:hAnsi="Courier New" w:cs="Courier New"/>
+                        <w:b/>
+                        <w:bCs/>
+                        <w:color w:val="000000" w:themeColor="text1"/>
+                        <w:sz w:val="20"/>
+                        <w:szCs w:val="20"/>
+                        <w:rtl/>
+                        <w:lang w:bidi="ar-AE"/>
+                      </w:rPr>
+                      <w:instrText xml:space="preserve"> \@ "</w:instrText>
+                    </w:r>
+                    <w:r>
+                      <w:rPr>
+                        <w:rFonts w:ascii="Courier New" w:hAnsi="Courier New" w:cs="Courier New"/>
+                        <w:b/>
+                        <w:bCs/>
+                        <w:color w:val="000000" w:themeColor="text1"/>
+                        <w:sz w:val="20"/>
+                        <w:szCs w:val="20"/>
+                        <w:lang w:bidi="ar-AE"/>
+                      </w:rPr>
+                      <w:instrText>dd MMMM, yyyy" \h</w:instrText>
+                    </w:r>
+                    <w:r>
+                      <w:rPr>
+                        <w:rFonts w:ascii="Courier New" w:hAnsi="Courier New" w:cs="Courier New"/>
+                        <w:b/>
+                        <w:bCs/>
+                        <w:color w:val="000000" w:themeColor="text1"/>
+                        <w:sz w:val="20"/>
+                        <w:szCs w:val="20"/>
+                        <w:rtl/>
+                        <w:lang w:bidi="ar-AE"/>
+                      </w:rPr>
+                      <w:instrText xml:space="preserve"> </w:instrText>
+                    </w:r>
+                    <w:r>
+                      <w:rPr>
+                        <w:rFonts w:ascii="Courier New" w:hAnsi="Courier New" w:cs="Courier New"/>
+                        <w:b/>
+                        <w:bCs/>
+                        <w:color w:val="000000" w:themeColor="text1"/>
+                        <w:sz w:val="20"/>
+                        <w:szCs w:val="20"/>
+                        <w:lang w:bidi="ar-AE"/>
+                      </w:rPr>
+                      <w:fldChar w:fldCharType="separate"/>
+                    </w:r>
+                    <w:r>
+                      <w:rPr>
+                        <w:rFonts w:ascii="Courier New" w:hAnsi="Courier New" w:cs="Courier New"/>
+                        <w:b/>
+                        <w:bCs/>
+                        <w:noProof/>
+                        <w:color w:val="000000" w:themeColor="text1"/>
+                        <w:sz w:val="20"/>
+                        <w:szCs w:val="20"/>
+                        <w:rtl/>
+                        <w:lang w:bidi="ar-AE"/>
+                      </w:rPr>
+                      <w:t>‏29‏ صفر‏، 1448</w:t>
+                    </w:r>
+                    <w:r>
+                      <w:rPr>
+                        <w:rFonts w:ascii="Courier New" w:hAnsi="Courier New" w:cs="Courier New"/>
+                        <w:b/>
+                        <w:bCs/>
+                        <w:color w:val="000000" w:themeColor="text1"/>
+                        <w:sz w:val="20"/>
+                        <w:szCs w:val="20"/>
+                        <w:lang w:bidi="ar-AE"/>
+                      </w:rPr>
+                      <w:fldChar w:fldCharType="end"/>
+                    </w:r>
+                    <w:r>
+                      <w:rPr>
+                        <w:rFonts w:ascii="Courier New" w:hAnsi="Courier New" w:cs="Courier New"/>
+                        <w:b/>
+                        <w:bCs/>
+                        <w:color w:val="000000" w:themeColor="text1"/>
+                        <w:sz w:val="20"/>
+                        <w:szCs w:val="20"/>
+                        <w:rtl/>
+                        <w:lang w:bidi="ar-AE"/>
+                      </w:rPr>
+                      <w:t>ه</w:t>
+                    </w:r>
+                    <w:r>
+                      <w:rPr>
+                        <w:rFonts w:ascii="Courier New" w:hAnsi="Courier New" w:cs="Courier New" w:hint="cs"/>
+                        <w:b/>
+                        <w:bCs/>
+                        <w:color w:val="000000" w:themeColor="text1"/>
+                        <w:sz w:val="20"/>
+                        <w:szCs w:val="20"/>
+                        <w:rtl/>
+                        <w:lang w:bidi="ar-AE"/>
+                      </w:rPr>
+                      <w:t>ـ</w:t>
+                    </w:r>
+                  </w:p>
+                  <w:p>
+                    <w:pPr>
+                      <w:jc w:val="right"/>
+                      <w:rPr>
+                        <w:rFonts w:cstheme="minorHAnsi" w:hint="cs"/>
+                        <w:b/>
+                        <w:bCs/>
+                        <w:color w:val="000000" w:themeColor="text1"/>
+                        <w:sz w:val="20"/>
+                        <w:szCs w:val="20"/>
+                        <w:rtl/>
+                        <w:lang w:val="en-US" w:bidi="ar-AE"/>
+                      </w:rPr>
+                    </w:pPr>
+                    <w:r>
+                      <w:rPr>
+                        <w:rFonts w:cstheme="minorHAnsi" w:hint="cs"/>
+                        <w:b/>
+                        <w:bCs/>
+                        <w:color w:val="000000" w:themeColor="text1"/>
+                        <w:sz w:val="20"/>
+                        <w:szCs w:val="20"/>
+                        <w:rtl/>
+                        <w:lang w:val="en-US" w:bidi="ar-AE"/>
+                      </w:rPr>
+                      <w:t>من تاريخ طباعة التصريح:</w:t>
+                    </w:r>
+                  </w:p>
+                  <w:p>
+                    <w:pPr>
+                      <w:rPr>
+                        <w:color w:val="000000" w:themeColor="text1"/>
+                      </w:rPr>
+                    </w:pPr>
+                  </w:p>
+                </w:txbxContent>
+              </v:textbox>
               <w10:wrap anchorx="page"/>
             </v:shape>
           </w:pict>
@@ -1183,7 +1912,87 @@
               <w:rFonts w:ascii="Helvetica" w:hAnsi="Helvetica"/>
               <w:b/>
               <w:bCs/>
-              <w:color w:val="FFFFFF" w:themeColor="background1"/>
+              <w:color w:val="000000" w:themeColor="text1"/>
+            </w:rPr>
+          </w:pPr>
+          <w:r>
+            <w:rPr>
+              <w:noProof/>
+            </w:rPr>
+            <mc:AlternateContent>
+              <mc:Choice Requires="wps">
+                <w:drawing>
+                  <wp:anchor distT="0" distB="0" distL="114300" distR="114300" simplePos="0" relativeHeight="251671552" behindDoc="0" locked="0" layoutInCell="1" allowOverlap="1" wp14:anchorId="5C55A48A" wp14:editId="20DF02BA">
+                    <wp:simplePos x="0" y="0"/>
+                    <wp:positionH relativeFrom="column">
+                      <wp:posOffset>-194310</wp:posOffset>
+                    </wp:positionH>
+                    <wp:positionV relativeFrom="paragraph">
+                      <wp:posOffset>-41910</wp:posOffset>
+                    </wp:positionV>
+                    <wp:extent cx="7124700" cy="0"/>
+                    <wp:effectExtent l="0" t="0" r="0" b="0"/>
+                    <wp:wrapNone/>
+                    <wp:docPr id="2057866282" name="Straight Connector 7"/>
+                    <wp:cNvGraphicFramePr/>
+                    <a:graphic xmlns:a="http://schemas.openxmlformats.org/drawingml/2006/main">
+                      <a:graphicData uri="http://schemas.microsoft.com/office/word/2010/wordprocessingShape">
+                        <wps:wsp>
+                          <wps:cNvCnPr/>
+                          <wps:spPr>
+                            <a:xfrm flipH="1">
+                              <a:off x="0" y="0"/>
+                              <a:ext cx="7124700" cy="0"/>
+                            </a:xfrm>
+                            <a:prstGeom prst="line">
+                              <a:avLst/>
+                            </a:prstGeom>
+                          </wps:spPr>
+                          <wps:style>
+                            <a:lnRef idx="1">
+                              <a:schemeClr val="dk1"/>
+                            </a:lnRef>
+                            <a:fillRef idx="0">
+                              <a:schemeClr val="dk1"/>
+                            </a:fillRef>
+                            <a:effectRef idx="0">
+                              <a:schemeClr val="dk1"/>
+                            </a:effectRef>
+                            <a:fontRef idx="minor">
+                              <a:schemeClr val="tx1"/>
+                            </a:fontRef>
+                          </wps:style>
+                          <wps:bodyPr/>
+                        </wps:wsp>
+                      </a:graphicData>
+                    </a:graphic>
+                    <wp14:sizeRelH relativeFrom="margin">
+                      <wp14:pctWidth>0</wp14:pctWidth>
+                    </wp14:sizeRelH>
+                    <wp14:sizeRelV relativeFrom="margin">
+                      <wp14:pctHeight>0</wp14:pctHeight>
+                    </wp14:sizeRelV>
+                  </wp:anchor>
+                </w:drawing>
+              </mc:Choice>
+              <mc:Fallback>
+                <w:pict>
+                  <v:line w14:anchorId="6152D44B" id="Straight Connector 7" o:spid="_x0000_s1026" style="position:absolute;flip:x;z-index:251671552;visibility:visible;mso-wrap-style:square;mso-width-percent:0;mso-height-percent:0;mso-wrap-distance-left:9pt;mso-wrap-distance-top:0;mso-wrap-distance-right:9pt;mso-wrap-distance-bottom:0;mso-position-horizontal:absolute;mso-position-horizontal-relative:text;mso-position-vertical:absolute;mso-position-vertical-relative:text;mso-width-percent:0;mso-height-percent:0;mso-width-relative:margin;mso-height-relative:margin" from="-15.3pt,-3.3pt" to="545.7pt,-3.3pt" o:gfxdata="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" strokecolor="black [3200]" strokeweight=".5pt">
+                    <v:stroke joinstyle="miter"/>
+                  </v:line>
+                </w:pict>
+              </mc:Fallback>
+            </mc:AlternateContent>
+          </w:r>
+        </w:p>
+        <w:p>
+          <w:pPr>
+            <w:pStyle w:val="Footer"/>
+            <w:rPr>
+              <w:rFonts w:ascii="Helvetica" w:hAnsi="Helvetica"/>
+              <w:b/>
+              <w:bCs/>
+              <w:color w:val="000000" w:themeColor="text1"/>
               <w:sz w:val="22"/>
               <w:szCs w:val="22"/>
             </w:rPr>
@@ -1193,7 +2002,7 @@
               <w:rFonts w:ascii="Helvetica" w:hAnsi="Helvetica"/>
               <w:b/>
               <w:bCs/>
-              <w:color w:val="FFFFFF" w:themeColor="background1"/>
+              <w:color w:val="000000" w:themeColor="text1"/>
             </w:rPr>
             <w:t>www.gss-group.net</w:t>
           </w:r>
@@ -1203,7 +2012,7 @@
             <w:pStyle w:val="Footer"/>
             <w:rPr>
               <w:rFonts w:ascii="Helvetica" w:hAnsi="Helvetica"/>
-              <w:color w:val="FFFFFF" w:themeColor="background1"/>
+              <w:color w:val="000000" w:themeColor="text1"/>
               <w:sz w:val="18"/>
               <w:szCs w:val="18"/>
             </w:rPr>
@@ -1212,7 +2021,7 @@
           <w:r>
             <w:rPr>
               <w:rFonts w:ascii="Helvetica" w:hAnsi="Helvetica"/>
-              <w:color w:val="FFFFFF" w:themeColor="background1"/>
+              <w:color w:val="000000" w:themeColor="text1"/>
               <w:sz w:val="18"/>
               <w:szCs w:val="18"/>
             </w:rPr>
@@ -1222,7 +2031,7 @@
           <w:r>
             <w:rPr>
               <w:rFonts w:ascii="Helvetica" w:hAnsi="Helvetica"/>
-              <w:color w:val="FFFFFF" w:themeColor="background1"/>
+              <w:color w:val="000000" w:themeColor="text1"/>
               <w:sz w:val="18"/>
               <w:szCs w:val="18"/>
             </w:rPr>
@@ -1232,7 +2041,7 @@
           <w:r>
             <w:rPr>
               <w:rFonts w:ascii="Helvetica" w:hAnsi="Helvetica"/>
-              <w:color w:val="FFFFFF" w:themeColor="background1"/>
+              <w:color w:val="000000" w:themeColor="text1"/>
               <w:sz w:val="18"/>
               <w:szCs w:val="18"/>
             </w:rPr>
@@ -1242,7 +2051,7 @@
           <w:r>
             <w:rPr>
               <w:rFonts w:ascii="Helvetica" w:hAnsi="Helvetica"/>
-              <w:color w:val="FFFFFF" w:themeColor="background1"/>
+              <w:color w:val="000000" w:themeColor="text1"/>
               <w:sz w:val="18"/>
               <w:szCs w:val="18"/>
             </w:rPr>
@@ -1398,6 +2207,75 @@
     <w:r>
       <w:rPr>
         <w:rFonts w:ascii="Helvetica" w:hAnsi="Helvetica"/>
+        <w:b/>
+        <w:bCs/>
+        <w:noProof/>
+        <w:color w:val="000000" w:themeColor="text1"/>
+        <w:sz w:val="22"/>
+        <w:szCs w:val="22"/>
+      </w:rPr>
+      <w:drawing>
+        <wp:anchor distT="0" distB="0" distL="114300" distR="114300" simplePos="0" relativeHeight="251672576" behindDoc="1" locked="0" layoutInCell="1" allowOverlap="1" wp14:anchorId="335388A5" wp14:editId="156BF94E">
+          <wp:simplePos x="0" y="0"/>
+          <wp:positionH relativeFrom="margin">
+            <wp:posOffset>2525898</wp:posOffset>
+          </wp:positionH>
+          <wp:positionV relativeFrom="paragraph">
+            <wp:posOffset>141006</wp:posOffset>
+          </wp:positionV>
+          <wp:extent cx="1665537" cy="67993"/>
+          <wp:effectExtent l="0" t="0" r="0" b="8255"/>
+          <wp:wrapNone/>
+          <wp:docPr id="1819313923" name="Picture 8"/>
+          <wp:cNvGraphicFramePr>
+            <a:graphicFrameLocks xmlns:a="http://schemas.openxmlformats.org/drawingml/2006/main" noChangeAspect="1"/>
+          </wp:cNvGraphicFramePr>
+          <a:graphic xmlns:a="http://schemas.openxmlformats.org/drawingml/2006/main">
+            <a:graphicData uri="http://schemas.openxmlformats.org/drawingml/2006/picture">
+              <pic:pic xmlns:pic="http://schemas.openxmlformats.org/drawingml/2006/picture">
+                <pic:nvPicPr>
+                  <pic:cNvPr id="1819313923" name="Picture 1819313923"/>
+                  <pic:cNvPicPr/>
+                </pic:nvPicPr>
+                <pic:blipFill>
+                  <a:blip r:embed="rId1">
+                    <a:extLst>
+                      <a:ext uri="{28A0092B-C50C-407E-A947-70E740481C1C}">
+                        <a14:useLocalDpi xmlns:a14="http://schemas.microsoft.com/office/drawing/2010/main" val="0"/>
+                      </a:ext>
+                      <a:ext uri="{837473B0-CC2E-450A-ABE3-18F120FF3D39}">
+                        <a1611:picAttrSrcUrl xmlns:a1611="http://schemas.microsoft.com/office/drawing/2016/11/main" r:id="rId2"/>
+                      </a:ext>
+                    </a:extLst>
+                  </a:blip>
+                  <a:stretch>
+                    <a:fillRect/>
+                  </a:stretch>
+                </pic:blipFill>
+                <pic:spPr>
+                  <a:xfrm>
+                    <a:off x="0" y="0"/>
+                    <a:ext cx="1665537" cy="67993"/>
+                  </a:xfrm>
+                  <a:prstGeom prst="rect">
+                    <a:avLst/>
+                  </a:prstGeom>
+                </pic:spPr>
+              </pic:pic>
+            </a:graphicData>
+          </a:graphic>
+          <wp14:sizeRelH relativeFrom="margin">
+            <wp14:pctWidth>0</wp14:pctWidth>
+          </wp14:sizeRelH>
+          <wp14:sizeRelV relativeFrom="margin">
+            <wp14:pctHeight>0</wp14:pctHeight>
+          </wp14:sizeRelV>
+        </wp:anchor>
+      </w:drawing>
+    </w:r>
+    <w:r>
+      <w:rPr>
+        <w:rFonts w:ascii="Helvetica" w:hAnsi="Helvetica"/>
         <w:noProof/>
         <w:color w:val="FF0000"/>
         <w:sz w:val="2"/>
@@ -1406,13 +2284,13 @@
       <mc:AlternateContent>
         <mc:Choice Requires="wps">
           <w:drawing>
-            <wp:anchor distT="0" distB="0" distL="114300" distR="114300" simplePos="0" relativeHeight="251668480" behindDoc="0" locked="0" layoutInCell="1" allowOverlap="1" wp14:anchorId="1CB3F01B" wp14:editId="42FE69F0">
+            <wp:anchor distT="0" distB="0" distL="114300" distR="114300" simplePos="0" relativeHeight="251668480" behindDoc="0" locked="0" layoutInCell="1" allowOverlap="1" wp14:anchorId="1CB3F01B" wp14:editId="74C74EA8">
               <wp:simplePos x="0" y="0"/>
               <wp:positionH relativeFrom="margin">
-                <wp:posOffset>1219784</wp:posOffset>
+                <wp:posOffset>1606245</wp:posOffset>
               </wp:positionH>
               <wp:positionV relativeFrom="paragraph">
-                <wp:posOffset>175311</wp:posOffset>
+                <wp:posOffset>179070</wp:posOffset>
               </wp:positionV>
               <wp:extent cx="4520794" cy="299923"/>
               <wp:effectExtent l="0" t="0" r="0" b="5080"/>
@@ -1441,37 +2319,37 @@
                         <w:p>
                           <w:pPr>
                             <w:rPr>
-                              <w:color w:val="FFFFFF" w:themeColor="background1"/>
+                              <w:color w:val="000000" w:themeColor="text1"/>
                               <w:lang w:val="en-US"/>
                             </w:rPr>
                           </w:pPr>
                           <w:r>
                             <w:rPr>
-                              <w:color w:val="FFFFFF" w:themeColor="background1"/>
+                              <w:color w:val="000000" w:themeColor="text1"/>
                             </w:rPr>
                             <w:t>h</w:t>
                           </w:r>
                           <w:r>
                             <w:rPr>
-                              <w:color w:val="FFFFFF" w:themeColor="background1"/>
+                              <w:color w:val="000000" w:themeColor="text1"/>
                             </w:rPr>
                             <w:t>ttps://</w:t>
                           </w:r>
                           <w:r>
                             <w:rPr>
-                              <w:color w:val="FFFFFF" w:themeColor="background1"/>
+                              <w:color w:val="000000" w:themeColor="text1"/>
                             </w:rPr>
                             <w:t>g</w:t>
                           </w:r>
                           <w:r>
                             <w:rPr>
-                              <w:color w:val="FFFFFF" w:themeColor="background1"/>
+                              <w:color w:val="000000" w:themeColor="text1"/>
                             </w:rPr>
                             <w:t>ssg.app/permits</w:t>
                           </w:r>
                           <w:r>
                             <w:rPr>
-                              <w:color w:val="FFFFFF" w:themeColor="background1"/>
+                              <w:color w:val="000000" w:themeColor="text1"/>
                             </w:rPr>
                             <w:t>/DocumentViewer/#classprint?</w:t>
                           </w:r>
@@ -1498,47 +2376,43 @@
         </mc:Choice>
         <mc:Fallback>
           <w:pict>
-            <v:shapetype w14:anchorId="1CB3F01B" id="_x0000_t202" coordsize="21600,21600" o:spt="202" path="m,l,21600r21600,l21600,xe">
-              <v:stroke joinstyle="miter"/>
-              <v:path gradientshapeok="t" o:connecttype="rect"/>
-            </v:shapetype>
-            <v:shape id="Text Box 5" o:spid="_x0000_s1026" type="#_x0000_t202" style="position:absolute;margin-left:96.05pt;margin-top:13.8pt;width:355.95pt;height:23.6pt;z-index:251668480;visibility:visible;mso-wrap-style:square;mso-width-percent:0;mso-height-percent:0;mso-wrap-distance-left:9pt;mso-wrap-distance-top:0;mso-wrap-distance-right:9pt;mso-wrap-distance-bottom:0;mso-position-horizontal:absolute;mso-position-horizontal-relative:margin;mso-position-vertical:absolute;mso-position-vertical-relative:text;mso-width-percent:0;mso-height-percent:0;mso-width-relative:margin;mso-height-relative:margin;v-text-anchor:top" o:gfxdata="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" filled="f" stroked="f" strokeweight=".5pt">
+            <v:shape w14:anchorId="1CB3F01B" id="Text Box 5" o:spid="_x0000_s1027" type="#_x0000_t202" style="position:absolute;margin-left:126.5pt;margin-top:14.1pt;width:355.95pt;height:23.6pt;z-index:251668480;visibility:visible;mso-wrap-style:square;mso-width-percent:0;mso-height-percent:0;mso-wrap-distance-left:9pt;mso-wrap-distance-top:0;mso-wrap-distance-right:9pt;mso-wrap-distance-bottom:0;mso-position-horizontal:absolute;mso-position-horizontal-relative:margin;mso-position-vertical:absolute;mso-position-vertical-relative:text;mso-width-percent:0;mso-height-percent:0;mso-width-relative:margin;mso-height-relative:margin;v-text-anchor:top" o:gfxdata="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" filled="f" stroked="f" strokeweight=".5pt">
               <v:textbox>
                 <w:txbxContent>
                   <w:p>
                     <w:pPr>
                       <w:rPr>
-                        <w:color w:val="FFFFFF" w:themeColor="background1"/>
+                        <w:color w:val="000000" w:themeColor="text1"/>
                         <w:lang w:val="en-US"/>
                       </w:rPr>
                     </w:pPr>
                     <w:r>
                       <w:rPr>
-                        <w:color w:val="FFFFFF" w:themeColor="background1"/>
+                        <w:color w:val="000000" w:themeColor="text1"/>
                       </w:rPr>
                       <w:t>h</w:t>
                     </w:r>
                     <w:r>
                       <w:rPr>
-                        <w:color w:val="FFFFFF" w:themeColor="background1"/>
+                        <w:color w:val="000000" w:themeColor="text1"/>
                       </w:rPr>
                       <w:t>ttps://</w:t>
                     </w:r>
                     <w:r>
                       <w:rPr>
-                        <w:color w:val="FFFFFF" w:themeColor="background1"/>
+                        <w:color w:val="000000" w:themeColor="text1"/>
                       </w:rPr>
                       <w:t>g</w:t>
                     </w:r>
                     <w:r>
                       <w:rPr>
-                        <w:color w:val="FFFFFF" w:themeColor="background1"/>
+                        <w:color w:val="000000" w:themeColor="text1"/>
                       </w:rPr>
                       <w:t>ssg.app/permits</w:t>
                     </w:r>
                     <w:r>
                       <w:rPr>
-                        <w:color w:val="FFFFFF" w:themeColor="background1"/>
+                        <w:color w:val="000000" w:themeColor="text1"/>
                       </w:rPr>
                       <w:t>/DocumentViewer/#classprint?</w:t>
                     </w:r>
@@ -1546,598 +2420,6 @@
                 </w:txbxContent>
               </v:textbox>
               <w10:wrap anchorx="margin"/>
-            </v:shape>
-          </w:pict>
-        </mc:Fallback>
-      </mc:AlternateContent>
-    </w:r>
-    <w:r>
-      <w:rPr>
-        <w:noProof/>
-      </w:rPr>
-      <mc:AlternateContent>
-        <mc:Choice Requires="wps">
-          <w:drawing>
-            <wp:anchor distT="45720" distB="45720" distL="114300" distR="114300" simplePos="0" relativeHeight="251667456" behindDoc="0" locked="0" layoutInCell="1" allowOverlap="1" wp14:anchorId="711A8D6C" wp14:editId="52483E7F">
-              <wp:simplePos x="0" y="0"/>
-              <wp:positionH relativeFrom="margin">
-                <wp:align>left</wp:align>
-              </wp:positionH>
-              <wp:positionV relativeFrom="paragraph">
-                <wp:posOffset>4521</wp:posOffset>
-              </wp:positionV>
-              <wp:extent cx="2360930" cy="1404620"/>
-              <wp:effectExtent l="0" t="0" r="0" b="0"/>
-              <wp:wrapNone/>
-              <wp:docPr id="217" name="Text Box 2"/>
-              <wp:cNvGraphicFramePr>
-                <a:graphicFrameLocks xmlns:a="http://schemas.openxmlformats.org/drawingml/2006/main"/>
-              </wp:cNvGraphicFramePr>
-              <a:graphic xmlns:a="http://schemas.openxmlformats.org/drawingml/2006/main">
-                <a:graphicData uri="http://schemas.microsoft.com/office/word/2010/wordprocessingShape">
-                  <wps:wsp>
-                    <wps:cNvSpPr txBox="1">
-                      <a:spLocks noChangeArrowheads="1"/>
-                    </wps:cNvSpPr>
-                    <wps:spPr bwMode="auto">
-                      <a:xfrm>
-                        <a:off x="0" y="0"/>
-                        <a:ext cx="2360930" cy="1404620"/>
-                      </a:xfrm>
-                      <a:prstGeom prst="rect">
-                        <a:avLst/>
-                      </a:prstGeom>
-                      <a:noFill/>
-                      <a:ln w="9525">
-                        <a:noFill/>
-                        <a:miter lim="800000"/>
-                        <a:headEnd/>
-                        <a:tailEnd/>
-                      </a:ln>
-                    </wps:spPr>
-                    <wps:txbx>
-                      <w:txbxContent>
-                        <w:p>
-                          <w:pPr>
-                            <w:rPr>
-                              <w:rFonts w:ascii="Courier New" w:hAnsi="Courier New" w:cs="Courier New"/>
-                              <w:color w:val="FFFFFF" w:themeColor="background1"/>
-                              <w:sz w:val="16"/>
-                              <w:szCs w:val="16"/>
-                              <w:lang w:bidi="ar-AE"/>
-                            </w:rPr>
-                          </w:pPr>
-                          <w:r>
-                            <w:rPr>
-                              <w:rFonts w:ascii="Courier New" w:hAnsi="Courier New" w:cs="Courier New"/>
-                              <w:color w:val="FFFFFF" w:themeColor="background1"/>
-                              <w:sz w:val="16"/>
-                              <w:szCs w:val="16"/>
-                              <w:rtl/>
-                              <w:lang w:bidi="ar-AE"/>
-                            </w:rPr>
-                            <w:fldChar w:fldCharType="begin"/>
-                          </w:r>
-                          <w:r>
-                            <w:rPr>
-                              <w:rFonts w:ascii="Courier New" w:hAnsi="Courier New" w:cs="Courier New"/>
-                              <w:color w:val="FFFFFF" w:themeColor="background1"/>
-                              <w:sz w:val="16"/>
-                              <w:szCs w:val="16"/>
-                              <w:rtl/>
-                              <w:lang w:bidi="ar-AE"/>
-                            </w:rPr>
-                            <w:instrText xml:space="preserve"> </w:instrText>
-                          </w:r>
-                          <w:r>
-                            <w:rPr>
-                              <w:rFonts w:ascii="Courier New" w:hAnsi="Courier New" w:cs="Courier New"/>
-                              <w:color w:val="FFFFFF" w:themeColor="background1"/>
-                              <w:sz w:val="16"/>
-                              <w:szCs w:val="16"/>
-                              <w:lang w:bidi="ar-AE"/>
-                            </w:rPr>
-                            <w:instrText>DATE</w:instrText>
-                          </w:r>
-                          <w:r>
-                            <w:rPr>
-                              <w:rFonts w:ascii="Courier New" w:hAnsi="Courier New" w:cs="Courier New"/>
-                              <w:color w:val="FFFFFF" w:themeColor="background1"/>
-                              <w:sz w:val="16"/>
-                              <w:szCs w:val="16"/>
-                              <w:rtl/>
-                              <w:lang w:bidi="ar-AE"/>
-                            </w:rPr>
-                            <w:instrText xml:space="preserve"> \@ "</w:instrText>
-                          </w:r>
-                          <w:r>
-                            <w:rPr>
-                              <w:rFonts w:ascii="Courier New" w:hAnsi="Courier New" w:cs="Courier New"/>
-                              <w:color w:val="FFFFFF" w:themeColor="background1"/>
-                              <w:sz w:val="16"/>
-                              <w:szCs w:val="16"/>
-                              <w:lang w:bidi="ar-AE"/>
-                            </w:rPr>
-                            <w:instrText>dd/MM/yyyy</w:instrText>
-                          </w:r>
-                          <w:r>
-                            <w:rPr>
-                              <w:rFonts w:ascii="Courier New" w:hAnsi="Courier New" w:cs="Courier New"/>
-                              <w:color w:val="FFFFFF" w:themeColor="background1"/>
-                              <w:sz w:val="16"/>
-                              <w:szCs w:val="16"/>
-                              <w:rtl/>
-                              <w:lang w:bidi="ar-AE"/>
-                            </w:rPr>
-                            <w:instrText xml:space="preserve">" </w:instrText>
-                          </w:r>
-                          <w:r>
-                            <w:rPr>
-                              <w:rFonts w:ascii="Courier New" w:hAnsi="Courier New" w:cs="Courier New"/>
-                              <w:color w:val="FFFFFF" w:themeColor="background1"/>
-                              <w:sz w:val="16"/>
-                              <w:szCs w:val="16"/>
-                              <w:rtl/>
-                              <w:lang w:bidi="ar-AE"/>
-                            </w:rPr>
-                            <w:fldChar w:fldCharType="separate"/>
-                          </w:r>
-                          <w:r>
-                            <w:rPr>
-                              <w:rFonts w:ascii="Courier New" w:hAnsi="Courier New" w:cs="Courier New"/>
-                              <w:noProof/>
-                              <w:color w:val="FFFFFF" w:themeColor="background1"/>
-                              <w:sz w:val="16"/>
-                              <w:szCs w:val="16"/>
-                              <w:rtl/>
-                              <w:lang w:bidi="ar-AE"/>
-                            </w:rPr>
-                            <w:t>‏13‏/08‏/2026</w:t>
-                          </w:r>
-                          <w:r>
-                            <w:rPr>
-                              <w:rFonts w:ascii="Courier New" w:hAnsi="Courier New" w:cs="Courier New"/>
-                              <w:color w:val="FFFFFF" w:themeColor="background1"/>
-                              <w:sz w:val="16"/>
-                              <w:szCs w:val="16"/>
-                              <w:rtl/>
-                              <w:lang w:bidi="ar-AE"/>
-                            </w:rPr>
-                            <w:fldChar w:fldCharType="end"/>
-                          </w:r>
-                        </w:p>
-                        <w:p>
-                          <w:pPr>
-                            <w:rPr>
-                              <w:rFonts w:ascii="Courier New" w:hAnsi="Courier New" w:cs="Courier New"/>
-                              <w:color w:val="FFFFFF" w:themeColor="background1"/>
-                              <w:sz w:val="16"/>
-                              <w:szCs w:val="16"/>
-                            </w:rPr>
-                          </w:pPr>
-                          <w:r>
-                            <w:rPr>
-                              <w:rFonts w:ascii="Courier New" w:hAnsi="Courier New" w:cs="Courier New"/>
-                              <w:color w:val="FFFFFF" w:themeColor="background1"/>
-                              <w:sz w:val="16"/>
-                              <w:szCs w:val="16"/>
-                              <w:lang w:bidi="ar-AE"/>
-                            </w:rPr>
-                            <w:fldChar w:fldCharType="begin"/>
-                          </w:r>
-                          <w:r>
-                            <w:rPr>
-                              <w:rFonts w:ascii="Courier New" w:hAnsi="Courier New" w:cs="Courier New"/>
-                              <w:color w:val="FFFFFF" w:themeColor="background1"/>
-                              <w:sz w:val="16"/>
-                              <w:szCs w:val="16"/>
-                              <w:rtl/>
-                              <w:lang w:bidi="ar-AE"/>
-                            </w:rPr>
-                            <w:instrText xml:space="preserve"> </w:instrText>
-                          </w:r>
-                          <w:r>
-                            <w:rPr>
-                              <w:rFonts w:ascii="Courier New" w:hAnsi="Courier New" w:cs="Courier New" w:hint="cs"/>
-                              <w:color w:val="FFFFFF" w:themeColor="background1"/>
-                              <w:sz w:val="16"/>
-                              <w:szCs w:val="16"/>
-                              <w:lang w:bidi="ar-AE"/>
-                            </w:rPr>
-                            <w:instrText>DATE</w:instrText>
-                          </w:r>
-                          <w:r>
-                            <w:rPr>
-                              <w:rFonts w:ascii="Courier New" w:hAnsi="Courier New" w:cs="Courier New" w:hint="cs"/>
-                              <w:color w:val="FFFFFF" w:themeColor="background1"/>
-                              <w:sz w:val="16"/>
-                              <w:szCs w:val="16"/>
-                              <w:rtl/>
-                              <w:lang w:bidi="ar-AE"/>
-                            </w:rPr>
-                            <w:instrText xml:space="preserve"> \@ "</w:instrText>
-                          </w:r>
-                          <w:r>
-                            <w:rPr>
-                              <w:rFonts w:ascii="Courier New" w:hAnsi="Courier New" w:cs="Courier New" w:hint="cs"/>
-                              <w:color w:val="FFFFFF" w:themeColor="background1"/>
-                              <w:sz w:val="16"/>
-                              <w:szCs w:val="16"/>
-                              <w:lang w:bidi="ar-AE"/>
-                            </w:rPr>
-                            <w:instrText>dd MMMM, yyyy" \h</w:instrText>
-                          </w:r>
-                          <w:r>
-                            <w:rPr>
-                              <w:rFonts w:ascii="Courier New" w:hAnsi="Courier New" w:cs="Courier New"/>
-                              <w:color w:val="FFFFFF" w:themeColor="background1"/>
-                              <w:sz w:val="16"/>
-                              <w:szCs w:val="16"/>
-                              <w:rtl/>
-                              <w:lang w:bidi="ar-AE"/>
-                            </w:rPr>
-                            <w:instrText xml:space="preserve"> </w:instrText>
-                          </w:r>
-                          <w:r>
-                            <w:rPr>
-                              <w:rFonts w:ascii="Courier New" w:hAnsi="Courier New" w:cs="Courier New"/>
-                              <w:color w:val="FFFFFF" w:themeColor="background1"/>
-                              <w:sz w:val="16"/>
-                              <w:szCs w:val="16"/>
-                              <w:lang w:bidi="ar-AE"/>
-                            </w:rPr>
-                            <w:fldChar w:fldCharType="separate"/>
-                          </w:r>
-                          <w:r>
-                            <w:rPr>
-                              <w:rFonts w:ascii="Courier New" w:hAnsi="Courier New" w:cs="Courier New"/>
-                              <w:noProof/>
-                              <w:color w:val="FFFFFF" w:themeColor="background1"/>
-                              <w:sz w:val="16"/>
-                              <w:szCs w:val="16"/>
-                              <w:rtl/>
-                              <w:lang w:bidi="ar-AE"/>
-                            </w:rPr>
-                            <w:t>‏29‏ صفر‏، 1448</w:t>
-                          </w:r>
-                          <w:r>
-                            <w:rPr>
-                              <w:rFonts w:ascii="Courier New" w:hAnsi="Courier New" w:cs="Courier New"/>
-                              <w:color w:val="FFFFFF" w:themeColor="background1"/>
-                              <w:sz w:val="16"/>
-                              <w:szCs w:val="16"/>
-                              <w:lang w:bidi="ar-AE"/>
-                            </w:rPr>
-                            <w:fldChar w:fldCharType="end"/>
-                          </w:r>
-                        </w:p>
-                      </w:txbxContent>
-                    </wps:txbx>
-                    <wps:bodyPr rot="0" vert="horz" wrap="square" lIns="91440" tIns="45720" rIns="91440" bIns="45720" anchor="t" anchorCtr="0">
-                      <a:spAutoFit/>
-                    </wps:bodyPr>
-                  </wps:wsp>
-                </a:graphicData>
-              </a:graphic>
-              <wp14:sizeRelH relativeFrom="margin">
-                <wp14:pctWidth>0</wp14:pctWidth>
-              </wp14:sizeRelH>
-              <wp14:sizeRelV relativeFrom="margin">
-                <wp14:pctHeight>0</wp14:pctHeight>
-              </wp14:sizeRelV>
-            </wp:anchor>
-          </w:drawing>
-        </mc:Choice>
-        <mc:Fallback>
-          <w:pict>
-            <v:shape w14:anchorId="711A8D6C" id="Text Box 2" o:spid="_x0000_s1027" type="#_x0000_t202" style="position:absolute;margin-left:0;margin-top:.35pt;width:185.9pt;height:110.6pt;z-index:251667456;visibility:visible;mso-wrap-style:square;mso-width-percent:0;mso-height-percent:0;mso-wrap-distance-left:9pt;mso-wrap-distance-top:3.6pt;mso-wrap-distance-right:9pt;mso-wrap-distance-bottom:3.6pt;mso-position-horizontal:left;mso-position-horizontal-relative:margin;mso-position-vertical:absolute;mso-position-vertical-relative:text;mso-width-percent:0;mso-height-percent:0;mso-width-relative:margin;mso-height-relative:margin;v-text-anchor:top" o:gfxdata="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" filled="f" stroked="f">
-              <v:textbox style="mso-fit-shape-to-text:t">
-                <w:txbxContent>
-                  <w:p>
-                    <w:pPr>
-                      <w:rPr>
-                        <w:rFonts w:ascii="Courier New" w:hAnsi="Courier New" w:cs="Courier New"/>
-                        <w:color w:val="FFFFFF" w:themeColor="background1"/>
-                        <w:sz w:val="16"/>
-                        <w:szCs w:val="16"/>
-                        <w:lang w:bidi="ar-AE"/>
-                      </w:rPr>
-                    </w:pPr>
-                    <w:r>
-                      <w:rPr>
-                        <w:rFonts w:ascii="Courier New" w:hAnsi="Courier New" w:cs="Courier New"/>
-                        <w:color w:val="FFFFFF" w:themeColor="background1"/>
-                        <w:sz w:val="16"/>
-                        <w:szCs w:val="16"/>
-                        <w:rtl/>
-                        <w:lang w:bidi="ar-AE"/>
-                      </w:rPr>
-                      <w:fldChar w:fldCharType="begin"/>
-                    </w:r>
-                    <w:r>
-                      <w:rPr>
-                        <w:rFonts w:ascii="Courier New" w:hAnsi="Courier New" w:cs="Courier New"/>
-                        <w:color w:val="FFFFFF" w:themeColor="background1"/>
-                        <w:sz w:val="16"/>
-                        <w:szCs w:val="16"/>
-                        <w:rtl/>
-                        <w:lang w:bidi="ar-AE"/>
-                      </w:rPr>
-                      <w:instrText xml:space="preserve"> </w:instrText>
-                    </w:r>
-                    <w:r>
-                      <w:rPr>
-                        <w:rFonts w:ascii="Courier New" w:hAnsi="Courier New" w:cs="Courier New"/>
-                        <w:color w:val="FFFFFF" w:themeColor="background1"/>
-                        <w:sz w:val="16"/>
-                        <w:szCs w:val="16"/>
-                        <w:lang w:bidi="ar-AE"/>
-                      </w:rPr>
-                      <w:instrText>DATE</w:instrText>
-                    </w:r>
-                    <w:r>
-                      <w:rPr>
-                        <w:rFonts w:ascii="Courier New" w:hAnsi="Courier New" w:cs="Courier New"/>
-                        <w:color w:val="FFFFFF" w:themeColor="background1"/>
-                        <w:sz w:val="16"/>
-                        <w:szCs w:val="16"/>
-                        <w:rtl/>
-                        <w:lang w:bidi="ar-AE"/>
-                      </w:rPr>
-                      <w:instrText xml:space="preserve"> \@ "</w:instrText>
-                    </w:r>
-                    <w:r>
-                      <w:rPr>
-                        <w:rFonts w:ascii="Courier New" w:hAnsi="Courier New" w:cs="Courier New"/>
-                        <w:color w:val="FFFFFF" w:themeColor="background1"/>
-                        <w:sz w:val="16"/>
-                        <w:szCs w:val="16"/>
-                        <w:lang w:bidi="ar-AE"/>
-                      </w:rPr>
-                      <w:instrText>dd/MM/yyyy</w:instrText>
-                    </w:r>
-                    <w:r>
-                      <w:rPr>
-                        <w:rFonts w:ascii="Courier New" w:hAnsi="Courier New" w:cs="Courier New"/>
-                        <w:color w:val="FFFFFF" w:themeColor="background1"/>
-                        <w:sz w:val="16"/>
-                        <w:szCs w:val="16"/>
-                        <w:rtl/>
-                        <w:lang w:bidi="ar-AE"/>
-                      </w:rPr>
-                      <w:instrText xml:space="preserve">" </w:instrText>
-                    </w:r>
-                    <w:r>
-                      <w:rPr>
-                        <w:rFonts w:ascii="Courier New" w:hAnsi="Courier New" w:cs="Courier New"/>
-                        <w:color w:val="FFFFFF" w:themeColor="background1"/>
-                        <w:sz w:val="16"/>
-                        <w:szCs w:val="16"/>
-                        <w:rtl/>
-                        <w:lang w:bidi="ar-AE"/>
-                      </w:rPr>
-                      <w:fldChar w:fldCharType="separate"/>
-                    </w:r>
-                    <w:r>
-                      <w:rPr>
-                        <w:rFonts w:ascii="Courier New" w:hAnsi="Courier New" w:cs="Courier New"/>
-                        <w:noProof/>
-                        <w:color w:val="FFFFFF" w:themeColor="background1"/>
-                        <w:sz w:val="16"/>
-                        <w:szCs w:val="16"/>
-                        <w:rtl/>
-                        <w:lang w:bidi="ar-AE"/>
-                      </w:rPr>
-                      <w:t>‏13‏/08‏/2026</w:t>
-                    </w:r>
-                    <w:r>
-                      <w:rPr>
-                        <w:rFonts w:ascii="Courier New" w:hAnsi="Courier New" w:cs="Courier New"/>
-                        <w:color w:val="FFFFFF" w:themeColor="background1"/>
-                        <w:sz w:val="16"/>
-                        <w:szCs w:val="16"/>
-                        <w:rtl/>
-                        <w:lang w:bidi="ar-AE"/>
-                      </w:rPr>
-                      <w:fldChar w:fldCharType="end"/>
-                    </w:r>
-                  </w:p>
-                  <w:p>
-                    <w:pPr>
-                      <w:rPr>
-                        <w:rFonts w:ascii="Courier New" w:hAnsi="Courier New" w:cs="Courier New"/>
-                        <w:color w:val="FFFFFF" w:themeColor="background1"/>
-                        <w:sz w:val="16"/>
-                        <w:szCs w:val="16"/>
-                      </w:rPr>
-                    </w:pPr>
-                    <w:r>
-                      <w:rPr>
-                        <w:rFonts w:ascii="Courier New" w:hAnsi="Courier New" w:cs="Courier New"/>
-                        <w:color w:val="FFFFFF" w:themeColor="background1"/>
-                        <w:sz w:val="16"/>
-                        <w:szCs w:val="16"/>
-                        <w:lang w:bidi="ar-AE"/>
-                      </w:rPr>
-                      <w:fldChar w:fldCharType="begin"/>
-                    </w:r>
-                    <w:r>
-                      <w:rPr>
-                        <w:rFonts w:ascii="Courier New" w:hAnsi="Courier New" w:cs="Courier New"/>
-                        <w:color w:val="FFFFFF" w:themeColor="background1"/>
-                        <w:sz w:val="16"/>
-                        <w:szCs w:val="16"/>
-                        <w:rtl/>
-                        <w:lang w:bidi="ar-AE"/>
-                      </w:rPr>
-                      <w:instrText xml:space="preserve"> </w:instrText>
-                    </w:r>
-                    <w:r>
-                      <w:rPr>
-                        <w:rFonts w:ascii="Courier New" w:hAnsi="Courier New" w:cs="Courier New" w:hint="cs"/>
-                        <w:color w:val="FFFFFF" w:themeColor="background1"/>
-                        <w:sz w:val="16"/>
-                        <w:szCs w:val="16"/>
-                        <w:lang w:bidi="ar-AE"/>
-                      </w:rPr>
-                      <w:instrText>DATE</w:instrText>
-                    </w:r>
-                    <w:r>
-                      <w:rPr>
-                        <w:rFonts w:ascii="Courier New" w:hAnsi="Courier New" w:cs="Courier New" w:hint="cs"/>
-                        <w:color w:val="FFFFFF" w:themeColor="background1"/>
-                        <w:sz w:val="16"/>
-                        <w:szCs w:val="16"/>
-                        <w:rtl/>
-                        <w:lang w:bidi="ar-AE"/>
-                      </w:rPr>
-                      <w:instrText xml:space="preserve"> \@ "</w:instrText>
-                    </w:r>
-                    <w:r>
-                      <w:rPr>
-                        <w:rFonts w:ascii="Courier New" w:hAnsi="Courier New" w:cs="Courier New" w:hint="cs"/>
-                        <w:color w:val="FFFFFF" w:themeColor="background1"/>
-                        <w:sz w:val="16"/>
-                        <w:szCs w:val="16"/>
-                        <w:lang w:bidi="ar-AE"/>
-                      </w:rPr>
-                      <w:instrText>dd MMMM, yyyy" \h</w:instrText>
-                    </w:r>
-                    <w:r>
-                      <w:rPr>
-                        <w:rFonts w:ascii="Courier New" w:hAnsi="Courier New" w:cs="Courier New"/>
-                        <w:color w:val="FFFFFF" w:themeColor="background1"/>
-                        <w:sz w:val="16"/>
-                        <w:szCs w:val="16"/>
-                        <w:rtl/>
-                        <w:lang w:bidi="ar-AE"/>
-                      </w:rPr>
-                      <w:instrText xml:space="preserve"> </w:instrText>
-                    </w:r>
-                    <w:r>
-                      <w:rPr>
-                        <w:rFonts w:ascii="Courier New" w:hAnsi="Courier New" w:cs="Courier New"/>
-                        <w:color w:val="FFFFFF" w:themeColor="background1"/>
-                        <w:sz w:val="16"/>
-                        <w:szCs w:val="16"/>
-                        <w:lang w:bidi="ar-AE"/>
-                      </w:rPr>
-                      <w:fldChar w:fldCharType="separate"/>
-                    </w:r>
-                    <w:r>
-                      <w:rPr>
-                        <w:rFonts w:ascii="Courier New" w:hAnsi="Courier New" w:cs="Courier New"/>
-                        <w:noProof/>
-                        <w:color w:val="FFFFFF" w:themeColor="background1"/>
-                        <w:sz w:val="16"/>
-                        <w:szCs w:val="16"/>
-                        <w:rtl/>
-                        <w:lang w:bidi="ar-AE"/>
-                      </w:rPr>
-                      <w:t>‏29‏ صفر‏، 1448</w:t>
-                    </w:r>
-                    <w:r>
-                      <w:rPr>
-                        <w:rFonts w:ascii="Courier New" w:hAnsi="Courier New" w:cs="Courier New"/>
-                        <w:color w:val="FFFFFF" w:themeColor="background1"/>
-                        <w:sz w:val="16"/>
-                        <w:szCs w:val="16"/>
-                        <w:lang w:bidi="ar-AE"/>
-                      </w:rPr>
-                      <w:fldChar w:fldCharType="end"/>
-                    </w:r>
-                  </w:p>
-                </w:txbxContent>
-              </v:textbox>
-              <w10:wrap anchorx="margin"/>
-            </v:shape>
-          </w:pict>
-        </mc:Fallback>
-      </mc:AlternateContent>
-    </w:r>
-    <w:r>
-      <w:rPr>
-        <w:rFonts w:ascii="Helvetica" w:hAnsi="Helvetica"/>
-        <w:noProof/>
-        <w:color w:val="FF0000"/>
-        <w:sz w:val="2"/>
-        <w:szCs w:val="2"/>
-      </w:rPr>
-      <mc:AlternateContent>
-        <mc:Choice Requires="wps">
-          <w:drawing>
-            <wp:anchor distT="0" distB="0" distL="114300" distR="114300" simplePos="0" relativeHeight="251661312" behindDoc="1" locked="0" layoutInCell="1" allowOverlap="1" wp14:anchorId="1FFFCD41" wp14:editId="3371FFBF">
-              <wp:simplePos x="0" y="0"/>
-              <wp:positionH relativeFrom="page">
-                <wp:posOffset>-428625</wp:posOffset>
-              </wp:positionH>
-              <wp:positionV relativeFrom="paragraph">
-                <wp:posOffset>-733425</wp:posOffset>
-              </wp:positionV>
-              <wp:extent cx="7734300" cy="1181100"/>
-              <wp:effectExtent l="0" t="0" r="0" b="0"/>
-              <wp:wrapNone/>
-              <wp:docPr id="7" name="Triangle 7"/>
-              <wp:cNvGraphicFramePr/>
-              <a:graphic xmlns:a="http://schemas.openxmlformats.org/drawingml/2006/main">
-                <a:graphicData uri="http://schemas.microsoft.com/office/word/2010/wordprocessingShape">
-                  <wps:wsp>
-                    <wps:cNvSpPr/>
-                    <wps:spPr>
-                      <a:xfrm>
-                        <a:off x="0" y="0"/>
-                        <a:ext cx="7734300" cy="1181100"/>
-                      </a:xfrm>
-                      <a:prstGeom prst="triangle">
-                        <a:avLst>
-                          <a:gd name="adj" fmla="val 0"/>
-                        </a:avLst>
-                      </a:prstGeom>
-                      <a:solidFill>
-                        <a:srgbClr val="C20000"/>
-                      </a:solidFill>
-                      <a:ln>
-                        <a:noFill/>
-                      </a:ln>
-                    </wps:spPr>
-                    <wps:style>
-                      <a:lnRef idx="2">
-                        <a:schemeClr val="accent1">
-                          <a:shade val="50000"/>
-                        </a:schemeClr>
-                      </a:lnRef>
-                      <a:fillRef idx="1">
-                        <a:schemeClr val="accent1"/>
-                      </a:fillRef>
-                      <a:effectRef idx="0">
-                        <a:schemeClr val="accent1"/>
-                      </a:effectRef>
-                      <a:fontRef idx="minor">
-                        <a:schemeClr val="lt1"/>
-                      </a:fontRef>
-                    </wps:style>
-                    <wps:bodyPr rot="0" spcFirstLastPara="0" vertOverflow="overflow" horzOverflow="overflow" vert="horz" wrap="square" lIns="91440" tIns="45720" rIns="91440" bIns="45720" numCol="1" spcCol="0" rtlCol="0" fromWordArt="0" anchor="ctr" anchorCtr="0" forceAA="0" compatLnSpc="1">
-                      <a:prstTxWarp prst="textNoShape">
-                        <a:avLst/>
-                      </a:prstTxWarp>
-                      <a:noAutofit/>
-                    </wps:bodyPr>
-                  </wps:wsp>
-                </a:graphicData>
-              </a:graphic>
-              <wp14:sizeRelH relativeFrom="margin">
-                <wp14:pctWidth>0</wp14:pctWidth>
-              </wp14:sizeRelH>
-              <wp14:sizeRelV relativeFrom="margin">
-                <wp14:pctHeight>0</wp14:pctHeight>
-              </wp14:sizeRelV>
-            </wp:anchor>
-          </w:drawing>
-        </mc:Choice>
-        <mc:Fallback>
-          <w:pict>
-            <v:shape w14:anchorId="41CC72B0" id="Triangle 7" o:spid="_x0000_s1026" type="#_x0000_t5" style="position:absolute;margin-left:-33.75pt;margin-top:-57.75pt;width:609pt;height:93pt;z-index:-251655168;visibility:visible;mso-wrap-style:square;mso-width-percent:0;mso-height-percent:0;mso-wrap-distance-left:9pt;mso-wrap-distance-top:0;mso-wrap-distance-right:9pt;mso-wrap-distance-bottom:0;mso-position-horizontal:absolute;mso-position-horizontal-relative:page;mso-position-vertical:absolute;mso-position-vertical-relative:text;mso-width-percent:0;mso-height-percent:0;mso-width-relative:margin;mso-height-relative:margin;v-text-anchor:middle" o:gfxdata="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" adj="0" fillcolor="#c20000" stroked="f" strokeweight="1pt">
-              <w10:wrap anchorx="page"/>
             </v:shape>
           </w:pict>
         </mc:Fallback>

</xml_diff>